<commit_message>
Revise article: new title, discussion on accumulation/configuration/integration, effect-size interpretation
Co-Authored-By: Claude Sonnet 5.5 <noreply@anthropic.com>
Claude-Session: https://claude.ai/code/session_01DuacjVccN1Mnk7wWXVWmjp
</commit_message>
<xml_diff>
--- a/MCS_G7_RESEARCH/06_PAPER/Beyond_MCS_Packages_WBES_G7.docx
+++ b/MCS_G7_RESEARCH/06_PAPER/Beyond_MCS_Packages_WBES_G7.docx
@@ -15,7 +15,7 @@
           <w:sz w:val="36"/>
           <w:szCs w:val="36"/>
         </w:rPr>
-        <w:t xml:space="preserve">Beyond Management Control Packages: Toward an Empirically Grounded Model of Management Control Practices</w:t>
+        <w:t xml:space="preserve">Management Control Practices as Configurations or Continuums? Exploratory Evidence from Seven Advanced Economies</w:t>
       </w:r>
     </w:p>
     <w:p>
@@ -31,7 +31,7 @@
           <w:sz w:val="26"/>
           <w:szCs w:val="26"/>
         </w:rPr>
-        <w:t xml:space="preserve">An Exploratory Investigation Using World Bank Enterprise Surveys Across G7 Countries</w:t>
+        <w:t xml:space="preserve">An Investigation Using World Bank Enterprise Surveys Across G7 Countries</w:t>
       </w:r>
     </w:p>
     <w:p>
@@ -72,7 +72,7 @@
         <w:rPr>
           <w:rFonts w:ascii="Times New Roman" w:cs="Times New Roman" w:eastAsia="Times New Roman" w:hAnsi="Times New Roman"/>
         </w:rPr>
-        <w:t xml:space="preserve">Management control research treats controls as a package, whereas management-practice research summarises practices in aggregate scores. We ask whether observable control practices form qualitatively distinct configurations or mainly differ in managerial sophistication. Using the management module of the World Bank Enterprise Surveys for seven G7 economies in 2024–2025 (6,316 establishments, mostly with 20 or more employees), we handle survey skip patterns explicitly and compare latent class, continuous latent-trait and hybrid models on a common likelihood scale. Latent classes are poorly separated (relative entropy 0.53–0.60 with three to four classes), residual dependence is substantial, and the three-class solution is ordered along the sophistication gradient without crossing on monitoring, targets and bonuses. Continuous and hybrid models fit better than purely discrete ones, and classes add no explanatory power over a continuous score for productivity or growth, which show modest positive associations with the score. Cross-country measurement invariance is only partial. A small, unstable class with targets but few bonuses is a tentative lead. We propose a four-layer model separating observed practices, empirical structure, theoretical interpretation and associations. The findings are exploratory, cross-sectional and limited by unverified question wording for several items; they are not evidence of distinct control systems and say nothing about interactive control use, AI, internal audit or dynamic capabilities.</w:t>
+        <w:t xml:space="preserve">Management control research treats controls as a package, whereas management-practice research summarises practices in aggregate scores. We ask whether observable control practices form qualitatively distinct configurations or mainly differ in managerial sophistication. Using the management module of the World Bank Enterprise Surveys for seven G7 economies in 2024–2025 (6,316 establishments, mostly with 20 or more employees), we handle survey skip patterns explicitly and compare latent class, continuous latent-trait and hybrid models on a common likelihood scale. Latent classes are poorly separated (relative entropy 0.53–0.60 with three to four classes), residual dependence is substantial, and the three-class solution is ordered along the sophistication gradient without crossing on monitoring, targets and bonuses. Continuous and hybrid models fit better than purely discrete ones, and classes add no explanatory power over a continuous score for productivity or growth, which show modest positive associations with the score. Cross-country measurement invariance is only partial. A small, unstable class with targets but few bonuses is a tentative lead. We distinguish accumulation, configuration and integration of practices (only the first two are observable) and propose a four-layer model separating observed practices, empirical structure, theoretical interpretation and associations. The findings are exploratory, cross-sectional and limited by unverified question wording for several items; they are not evidence of distinct control systems and say nothing about interactive control use, AI, internal audit or dynamic capabilities.</w:t>
       </w:r>
     </w:p>
     <w:p>
@@ -9175,22 +9175,30 @@
       <w:r>
         <w:rPr>
           <w:rFonts w:ascii="Times New Roman" w:cs="Times New Roman" w:eastAsia="Times New Roman" w:hAnsi="Times New Roman"/>
-        </w:rPr>
-        <w:t xml:space="preserve">The evidence supports a predominantly </w:t>
-      </w:r>
-      <w:r>
-        <w:rPr>
-          <w:rFonts w:ascii="Times New Roman" w:cs="Times New Roman" w:eastAsia="Times New Roman" w:hAnsi="Times New Roman"/>
           <w:b/>
           <w:bCs/>
         </w:rPr>
-        <w:t xml:space="preserve">gradient</w:t>
-      </w:r>
-      <w:r>
-        <w:rPr>
-          <w:rFonts w:ascii="Times New Roman" w:cs="Times New Roman" w:eastAsia="Times New Roman" w:hAnsi="Times New Roman"/>
-        </w:rPr>
-        <w:t xml:space="preserve"> reading of observable control practices in these data: the practices share a dominant continuous dimension; latent classes are poorly separated, ordered along that dimension when K = 3, and add no explanatory value over the continuous score. A small, unstable class suggests that targets without matching incentives may exist, but this is tentative. We do not claim distinct forms of control.</w:t>
+        <w:t xml:space="preserve">What can the co-occurrence of management practices tell us about management control systems?</w:t>
+      </w:r>
+      <w:r>
+        <w:rPr>
+          <w:rFonts w:ascii="Times New Roman" w:cs="Times New Roman" w:eastAsia="Times New Roman" w:hAnsi="Times New Roman"/>
+        </w:rPr>
+        <w:t xml:space="preserve"> Our central empirical result is negative with respect to configurations: in these data, the observable practices share a dominant continuous dimension; latent classes are poorly separated, are ordered along that dimension when K = 3, and add no explanatory value over a continuous score. That firms with more practices obtain higher scores is unsurprising. What the analysis adds is a test of a prior question: whether the structure of observed practices </w:t>
+      </w:r>
+      <w:r>
+        <w:rPr>
+          <w:rFonts w:ascii="Times New Roman" w:cs="Times New Roman" w:eastAsia="Times New Roman" w:hAnsi="Times New Roman"/>
+          <w:i/>
+          <w:iCs/>
+        </w:rPr>
+        <w:t xml:space="preserve">warrants</w:t>
+      </w:r>
+      <w:r>
+        <w:rPr>
+          <w:rFonts w:ascii="Times New Roman" w:cs="Times New Roman" w:eastAsia="Times New Roman" w:hAnsi="Times New Roman"/>
+        </w:rPr>
+        <w:t xml:space="preserve"> a configurational reading at all. Within the six universal WBES items, it largely does not.</w:t>
       </w:r>
     </w:p>
     <w:p>
@@ -9201,8 +9209,158 @@
       <w:r>
         <w:rPr>
           <w:rFonts w:ascii="Times New Roman" w:cs="Times New Roman" w:eastAsia="Times New Roman" w:hAnsi="Times New Roman"/>
-        </w:rPr>
-        <w:t xml:space="preserve">Relative to Bloom and Van Reenen (2007), an aggregate score is not shown to be inadequate here; configuration-based analysis adds little for the outcomes examined. Relative to Malmi and Brown (2008), we find co-occurrence of monitoring, targets and bonuses beyond independence, but cannot speak to cultural, planning or administrative controls. Relative to Simons (1995), the observed practices are compatible with diagnostic control, but nothing in WBES identifies interactive use. The results are mainly descriptive and should not be treated as a theory of management control.</w:t>
+          <w:b/>
+          <w:bCs/>
+        </w:rPr>
+        <w:t xml:space="preserve">Three concepts that co-occurrence data cannot separate.</w:t>
+      </w:r>
+      <w:r>
+        <w:rPr>
+          <w:rFonts w:ascii="Times New Roman" w:cs="Times New Roman" w:eastAsia="Times New Roman" w:hAnsi="Times New Roman"/>
+        </w:rPr>
+        <w:t xml:space="preserve"> We distinguish (i) </w:t>
+      </w:r>
+      <w:r>
+        <w:rPr>
+          <w:rFonts w:ascii="Times New Roman" w:cs="Times New Roman" w:eastAsia="Times New Roman" w:hAnsi="Times New Roman"/>
+          <w:i/>
+          <w:iCs/>
+        </w:rPr>
+        <w:t xml:space="preserve">accumulation</w:t>
+      </w:r>
+      <w:r>
+        <w:rPr>
+          <w:rFonts w:ascii="Times New Roman" w:cs="Times New Roman" w:eastAsia="Times New Roman" w:hAnsi="Times New Roman"/>
+        </w:rPr>
+        <w:t xml:space="preserve">, the number of monitoring, target and incentive practices a firm has; (ii) </w:t>
+      </w:r>
+      <w:r>
+        <w:rPr>
+          <w:rFonts w:ascii="Times New Roman" w:cs="Times New Roman" w:eastAsia="Times New Roman" w:hAnsi="Times New Roman"/>
+          <w:i/>
+          <w:iCs/>
+        </w:rPr>
+        <w:t xml:space="preserve">configuration</w:t>
+      </w:r>
+      <w:r>
+        <w:rPr>
+          <w:rFonts w:ascii="Times New Roman" w:cs="Times New Roman" w:eastAsia="Times New Roman" w:hAnsi="Times New Roman"/>
+        </w:rPr>
+        <w:t xml:space="preserve">, combinations whose character is not reducible to that number; and (iii) </w:t>
+      </w:r>
+      <w:r>
+        <w:rPr>
+          <w:rFonts w:ascii="Times New Roman" w:cs="Times New Roman" w:eastAsia="Times New Roman" w:hAnsi="Times New Roman"/>
+          <w:i/>
+          <w:iCs/>
+        </w:rPr>
+        <w:t xml:space="preserve">integration</w:t>
+      </w:r>
+      <w:r>
+        <w:rPr>
+          <w:rFonts w:ascii="Times New Roman" w:cs="Times New Roman" w:eastAsia="Times New Roman" w:hAnsi="Times New Roman"/>
+        </w:rPr>
+        <w:t xml:space="preserve">, practices that are articulated and used jointly to steer behaviour and decisions. Our data speak, in a limited way, to (i) and (ii): accumulation accounts for most detectable structure, and configuration adds little. They are silent on (iii). A firm may hold dashboards, targets and bonuses without these operating as a coherent system, which is the package-versus-system distinction of Grabner and Moers (2013). The implication, offered as a </w:t>
+      </w:r>
+      <w:r>
+        <w:rPr>
+          <w:rFonts w:ascii="Times New Roman" w:cs="Times New Roman" w:eastAsia="Times New Roman" w:hAnsi="Times New Roman"/>
+          <w:b/>
+          <w:bCs/>
+        </w:rPr>
+        <w:t xml:space="preserve">theoretical interpretation and not as a demonstrated result</w:t>
+      </w:r>
+      <w:r>
+        <w:rPr>
+          <w:rFonts w:ascii="Times New Roman" w:cs="Times New Roman" w:eastAsia="Times New Roman" w:hAnsi="Times New Roman"/>
+        </w:rPr>
+        <w:t xml:space="preserve">, is that inferring a control </w:t>
+      </w:r>
+      <w:r>
+        <w:rPr>
+          <w:rFonts w:ascii="Times New Roman" w:cs="Times New Roman" w:eastAsia="Times New Roman" w:hAnsi="Times New Roman"/>
+          <w:i/>
+          <w:iCs/>
+        </w:rPr>
+        <w:t xml:space="preserve">system</w:t>
+      </w:r>
+      <w:r>
+        <w:rPr>
+          <w:rFonts w:ascii="Times New Roman" w:cs="Times New Roman" w:eastAsia="Times New Roman" w:hAnsi="Times New Roman"/>
+        </w:rPr>
+        <w:t xml:space="preserve"> from the observable presence of practices is hazardous, and that future work should measure articulation and use directly.</w:t>
+      </w:r>
+    </w:p>
+    <w:p>
+      <w:pPr>
+        <w:spacing w:after="120" w:line="300"/>
+        <w:jc w:val="both"/>
+      </w:pPr>
+      <w:r>
+        <w:rPr>
+          <w:rFonts w:ascii="Times New Roman" w:cs="Times New Roman" w:eastAsia="Times New Roman" w:hAnsi="Times New Roman"/>
+          <w:b/>
+          <w:bCs/>
+        </w:rPr>
+        <w:t xml:space="preserve">Relation to the three frameworks.</w:t>
+      </w:r>
+      <w:r>
+        <w:rPr>
+          <w:rFonts w:ascii="Times New Roman" w:cs="Times New Roman" w:eastAsia="Times New Roman" w:hAnsi="Times New Roman"/>
+        </w:rPr>
+        <w:t xml:space="preserve"> Our results do not refute Malmi and Brown (2008): WBES observes mainly cybernetic and reward controls, so a package perspective covering cultural, planning and administrative controls is not tested. Relative to Bloom and Van Reenen (2007), an aggregate score is not shown to be inadequate for the outcomes examined. Relative to Simons (1995), monitoring and targets are compatible with diagnostic control, but nothing in WBES identifies interactive use.</w:t>
+      </w:r>
+    </w:p>
+    <w:p>
+      <w:pPr>
+        <w:spacing w:after="120" w:line="300"/>
+        <w:jc w:val="both"/>
+      </w:pPr>
+      <w:r>
+        <w:rPr>
+          <w:rFonts w:ascii="Times New Roman" w:cs="Times New Roman" w:eastAsia="Times New Roman" w:hAnsi="Times New Roman"/>
+          <w:b/>
+          <w:bCs/>
+        </w:rPr>
+        <w:t xml:space="preserve">A tentative lead.</w:t>
+      </w:r>
+      <w:r>
+        <w:rPr>
+          <w:rFonts w:ascii="Times New Roman" w:cs="Times New Roman" w:eastAsia="Times New Roman" w:hAnsi="Times New Roman"/>
+        </w:rPr>
+        <w:t xml:space="preserve"> The four-class solution contains a small class (about 5–7%) with near-universal targets but few bonuses. One could conjecture that targets without matched incentives reflect incomplete integration, but the class is unstable across subsamples and weights and we draw no conclusion from it.</w:t>
+      </w:r>
+    </w:p>
+    <w:p>
+      <w:pPr>
+        <w:spacing w:after="120" w:line="300"/>
+        <w:jc w:val="both"/>
+      </w:pPr>
+      <w:r>
+        <w:rPr>
+          <w:rFonts w:ascii="Times New Roman" w:cs="Times New Roman" w:eastAsia="Times New Roman" w:hAnsi="Times New Roman"/>
+          <w:b/>
+          <w:bCs/>
+        </w:rPr>
+        <w:t xml:space="preserve">Significance, economic importance, prediction and causality.</w:t>
+      </w:r>
+      <w:r>
+        <w:rPr>
+          <w:rFonts w:ascii="Times New Roman" w:cs="Times New Roman" w:eastAsia="Times New Roman" w:hAnsi="Times New Roman"/>
+        </w:rPr>
+        <w:t xml:space="preserve"> One standard deviation of the continuous score is associated with about 13.7% higher sales per employee within country (exp(0.128) − 1), a statistically precise and economically non-trivial association, but the out-of-sample gain is modest (cross-validated RMSE 0.810 to 0.803, about 0.9%). For annual sales growth (+0.33 percentage points per SD) and employment growth (+0.18 points), the predictive gain is negligible (about 0.1% and 0%). None of these is evidence that accumulating practices causes better performance: the data are cross-sectional and self-reported, productivity may be partly reversed in causality, and unobserved firm quality may drive both.</w:t>
+      </w:r>
+    </w:p>
+    <w:p>
+      <w:pPr>
+        <w:spacing w:after="120" w:line="300"/>
+        <w:jc w:val="both"/>
+      </w:pPr>
+      <w:r>
+        <w:rPr>
+          <w:rFonts w:ascii="Times New Roman" w:cs="Times New Roman" w:eastAsia="Times New Roman" w:hAnsi="Times New Roman"/>
+        </w:rPr>
+        <w:t xml:space="preserve">The results are mainly descriptive and should not be treated as a theory of management control.</w:t>
       </w:r>
     </w:p>
     <w:p>

</xml_diff>